<commit_message>
Enablement Word copies: the final seven, matching the reviewed sources
Co-Authored-By: Claude Fable 5.1 <noreply@anthropic.com>
</commit_message>
<xml_diff>
--- a/docs/enablement/word/Enablement-Selling-It-v1.0.docx
+++ b/docs/enablement/word/Enablement-Selling-It-v1.0.docx
@@ -727,7 +727,7 @@
         </w:rPr>
         <w:t xml:space="preserve">These are the rows an account executive needs. Every row, with its caveat, is on </w:t>
       </w:r>
-      <w:hyperlink w:history="1" r:id="rIdclf8mejfffxjy9mn5bfan">
+      <w:hyperlink w:history="1" r:id="rIdptkcwky6a69ktydivrvof">
         <w:r>
           <w:rPr>
             <w:rFonts w:ascii="Calibri" w:cs="Calibri" w:eastAsia="Calibri" w:hAnsi="Calibri"/>
@@ -748,7 +748,7 @@
         </w:rPr>
         <w:t xml:space="preserve">, and every term is in the </w:t>
       </w:r>
-      <w:hyperlink w:history="1" r:id="rIdj2kyqhcdm5wvncpz1g6kf">
+      <w:hyperlink w:history="1" r:id="rIdxffyn3prqbnnxbxzd0pxe">
         <w:r>
           <w:rPr>
             <w:rFonts w:ascii="Calibri" w:cs="Calibri" w:eastAsia="Calibri" w:hAnsi="Calibri"/>
@@ -5056,7 +5056,7 @@
         </w:rPr>
         <w:t xml:space="preserve"> The demo map answers that: </w:t>
       </w:r>
-      <w:hyperlink w:history="1" r:id="rIdnjf1kvsdjuesaofdgenab">
+      <w:hyperlink w:history="1" r:id="rId5t2zhfctqdy0gkbf0kci0">
         <w:r>
           <w:rPr>
             <w:rFonts w:ascii="Calibri" w:cs="Calibri" w:eastAsia="Calibri" w:hAnsi="Calibri"/>
@@ -5124,7 +5124,7 @@
         </w:rPr>
         <w:t xml:space="preserve">The whole boundary is on the credits page, </w:t>
       </w:r>
-      <w:hyperlink w:history="1" r:id="rIdiipgsklyincki2hn_0kan">
+      <w:hyperlink w:history="1" r:id="rId1lsfg7d67kzpxqwejpgv8">
         <w:r>
           <w:rPr>
             <w:rFonts w:ascii="Calibri" w:cs="Calibri" w:eastAsia="Calibri" w:hAnsi="Calibri"/>
@@ -5178,7 +5178,7 @@
         </w:rPr>
         <w:t xml:space="preserve">Bring one for architecture and the stack; the arithmetic; integration and the events; data, privacy and retention detail; and any question this page answers with open. Their piece is </w:t>
       </w:r>
-      <w:hyperlink w:history="1" r:id="rIdj0d0kkj1elkignghu6uny">
+      <w:hyperlink w:history="1" r:id="rId8j-3slgx3dnloomeqmr2e">
         <w:r>
           <w:rPr>
             <w:rFonts w:ascii="Calibri" w:cs="Calibri" w:eastAsia="Calibri" w:hAnsi="Calibri"/>
@@ -5427,8 +5427,8 @@
         </w:tblBorders>
       </w:tblPr>
       <w:tblGrid>
-        <w:gridCol w:w="4333"/>
-        <w:gridCol w:w="5027"/>
+        <w:gridCol w:w="4309"/>
+        <w:gridCol w:w="5051"/>
       </w:tblGrid>
       <w:tr>
         <w:trPr>
@@ -5436,7 +5436,7 @@
         </w:trPr>
         <w:tc>
           <w:tcPr>
-            <w:tcW w:type="dxa" w:w="4333"/>
+            <w:tcW w:type="dxa" w:w="4309"/>
             <w:shd w:fill="E8EDF4" w:val="clear"/>
             <w:tcMar>
               <w:top w:type="dxa" w:w="70"/>
@@ -5464,7 +5464,7 @@
         </w:tc>
         <w:tc>
           <w:tcPr>
-            <w:tcW w:type="dxa" w:w="5027"/>
+            <w:tcW w:type="dxa" w:w="5051"/>
             <w:shd w:fill="E8EDF4" w:val="clear"/>
             <w:tcMar>
               <w:top w:type="dxa" w:w="70"/>
@@ -5494,7 +5494,7 @@
       <w:tr>
         <w:tc>
           <w:tcPr>
-            <w:tcW w:type="dxa" w:w="4333"/>
+            <w:tcW w:type="dxa" w:w="4309"/>
             <w:shd w:fill="FFFFFF" w:val="clear"/>
             <w:tcMar>
               <w:top w:type="dxa" w:w="70"/>
@@ -5520,7 +5520,7 @@
         </w:tc>
         <w:tc>
           <w:tcPr>
-            <w:tcW w:type="dxa" w:w="5027"/>
+            <w:tcW w:type="dxa" w:w="5051"/>
             <w:shd w:fill="FFFFFF" w:val="clear"/>
             <w:tcMar>
               <w:top w:type="dxa" w:w="70"/>
@@ -5548,7 +5548,7 @@
       <w:tr>
         <w:tc>
           <w:tcPr>
-            <w:tcW w:type="dxa" w:w="4333"/>
+            <w:tcW w:type="dxa" w:w="4309"/>
             <w:shd w:fill="F6F8FB" w:val="clear"/>
             <w:tcMar>
               <w:top w:type="dxa" w:w="70"/>
@@ -5568,13 +5568,13 @@
                 <w:sz w:val="19"/>
                 <w:szCs w:val="19"/>
               </w:rPr>
-              <w:t xml:space="preserve">"Real-time interest", "sub-second decisions", "instant", or any timing or throughput figure</w:t>
-            </w:r>
-          </w:p>
-        </w:tc>
-        <w:tc>
-          <w:tcPr>
-            <w:tcW w:type="dxa" w:w="5027"/>
+              <w:t xml:space="preserve">"Real-time interest", "instant", or any timing or throughput figure</w:t>
+            </w:r>
+          </w:p>
+        </w:tc>
+        <w:tc>
+          <w:tcPr>
+            <w:tcW w:type="dxa" w:w="5051"/>
             <w:shd w:fill="F6F8FB" w:val="clear"/>
             <w:tcMar>
               <w:top w:type="dxa" w:w="70"/>
@@ -5602,7 +5602,7 @@
       <w:tr>
         <w:tc>
           <w:tcPr>
-            <w:tcW w:type="dxa" w:w="4333"/>
+            <w:tcW w:type="dxa" w:w="4309"/>
             <w:shd w:fill="FFFFFF" w:val="clear"/>
             <w:tcMar>
               <w:top w:type="dxa" w:w="70"/>
@@ -5628,7 +5628,7 @@
         </w:tc>
         <w:tc>
           <w:tcPr>
-            <w:tcW w:type="dxa" w:w="5027"/>
+            <w:tcW w:type="dxa" w:w="5051"/>
             <w:shd w:fill="FFFFFF" w:val="clear"/>
             <w:tcMar>
               <w:top w:type="dxa" w:w="70"/>
@@ -5656,7 +5656,7 @@
       <w:tr>
         <w:tc>
           <w:tcPr>
-            <w:tcW w:type="dxa" w:w="4333"/>
+            <w:tcW w:type="dxa" w:w="4309"/>
             <w:shd w:fill="F6F8FB" w:val="clear"/>
             <w:tcMar>
               <w:top w:type="dxa" w:w="70"/>
@@ -5682,7 +5682,7 @@
         </w:tc>
         <w:tc>
           <w:tcPr>
-            <w:tcW w:type="dxa" w:w="5027"/>
+            <w:tcW w:type="dxa" w:w="5051"/>
             <w:shd w:fill="F6F8FB" w:val="clear"/>
             <w:tcMar>
               <w:top w:type="dxa" w:w="70"/>
@@ -5710,7 +5710,7 @@
       <w:tr>
         <w:tc>
           <w:tcPr>
-            <w:tcW w:type="dxa" w:w="4333"/>
+            <w:tcW w:type="dxa" w:w="4309"/>
             <w:shd w:fill="FFFFFF" w:val="clear"/>
             <w:tcMar>
               <w:top w:type="dxa" w:w="70"/>
@@ -5736,7 +5736,7 @@
         </w:tc>
         <w:tc>
           <w:tcPr>
-            <w:tcW w:type="dxa" w:w="5027"/>
+            <w:tcW w:type="dxa" w:w="5051"/>
             <w:shd w:fill="FFFFFF" w:val="clear"/>
             <w:tcMar>
               <w:top w:type="dxa" w:w="70"/>
@@ -5764,7 +5764,7 @@
       <w:tr>
         <w:tc>
           <w:tcPr>
-            <w:tcW w:type="dxa" w:w="4333"/>
+            <w:tcW w:type="dxa" w:w="4309"/>
             <w:shd w:fill="F6F8FB" w:val="clear"/>
             <w:tcMar>
               <w:top w:type="dxa" w:w="70"/>
@@ -5790,7 +5790,7 @@
         </w:tc>
         <w:tc>
           <w:tcPr>
-            <w:tcW w:type="dxa" w:w="5027"/>
+            <w:tcW w:type="dxa" w:w="5051"/>
             <w:shd w:fill="F6F8FB" w:val="clear"/>
             <w:tcMar>
               <w:top w:type="dxa" w:w="70"/>
@@ -5818,7 +5818,7 @@
       <w:tr>
         <w:tc>
           <w:tcPr>
-            <w:tcW w:type="dxa" w:w="4333"/>
+            <w:tcW w:type="dxa" w:w="4309"/>
             <w:shd w:fill="FFFFFF" w:val="clear"/>
             <w:tcMar>
               <w:top w:type="dxa" w:w="70"/>
@@ -5844,7 +5844,7 @@
         </w:tc>
         <w:tc>
           <w:tcPr>
-            <w:tcW w:type="dxa" w:w="5027"/>
+            <w:tcW w:type="dxa" w:w="5051"/>
             <w:shd w:fill="FFFFFF" w:val="clear"/>
             <w:tcMar>
               <w:top w:type="dxa" w:w="70"/>
@@ -5872,7 +5872,7 @@
       <w:tr>
         <w:tc>
           <w:tcPr>
-            <w:tcW w:type="dxa" w:w="4333"/>
+            <w:tcW w:type="dxa" w:w="4309"/>
             <w:shd w:fill="F6F8FB" w:val="clear"/>
             <w:tcMar>
               <w:top w:type="dxa" w:w="70"/>
@@ -5898,7 +5898,7 @@
         </w:tc>
         <w:tc>
           <w:tcPr>
-            <w:tcW w:type="dxa" w:w="5027"/>
+            <w:tcW w:type="dxa" w:w="5051"/>
             <w:shd w:fill="F6F8FB" w:val="clear"/>
             <w:tcMar>
               <w:top w:type="dxa" w:w="70"/>
@@ -5926,7 +5926,7 @@
       <w:tr>
         <w:tc>
           <w:tcPr>
-            <w:tcW w:type="dxa" w:w="4333"/>
+            <w:tcW w:type="dxa" w:w="4309"/>
             <w:shd w:fill="FFFFFF" w:val="clear"/>
             <w:tcMar>
               <w:top w:type="dxa" w:w="70"/>
@@ -5952,7 +5952,7 @@
         </w:tc>
         <w:tc>
           <w:tcPr>
-            <w:tcW w:type="dxa" w:w="5027"/>
+            <w:tcW w:type="dxa" w:w="5051"/>
             <w:shd w:fill="FFFFFF" w:val="clear"/>
             <w:tcMar>
               <w:top w:type="dxa" w:w="70"/>
@@ -5980,7 +5980,7 @@
       <w:tr>
         <w:tc>
           <w:tcPr>
-            <w:tcW w:type="dxa" w:w="4333"/>
+            <w:tcW w:type="dxa" w:w="4309"/>
             <w:shd w:fill="F6F8FB" w:val="clear"/>
             <w:tcMar>
               <w:top w:type="dxa" w:w="70"/>
@@ -6006,7 +6006,7 @@
         </w:tc>
         <w:tc>
           <w:tcPr>
-            <w:tcW w:type="dxa" w:w="5027"/>
+            <w:tcW w:type="dxa" w:w="5051"/>
             <w:shd w:fill="F6F8FB" w:val="clear"/>
             <w:tcMar>
               <w:top w:type="dxa" w:w="70"/>
@@ -6034,7 +6034,7 @@
       <w:tr>
         <w:tc>
           <w:tcPr>
-            <w:tcW w:type="dxa" w:w="4333"/>
+            <w:tcW w:type="dxa" w:w="4309"/>
             <w:shd w:fill="FFFFFF" w:val="clear"/>
             <w:tcMar>
               <w:top w:type="dxa" w:w="70"/>
@@ -6060,7 +6060,7 @@
         </w:tc>
         <w:tc>
           <w:tcPr>
-            <w:tcW w:type="dxa" w:w="5027"/>
+            <w:tcW w:type="dxa" w:w="5051"/>
             <w:shd w:fill="FFFFFF" w:val="clear"/>
             <w:tcMar>
               <w:top w:type="dxa" w:w="70"/>
@@ -6088,7 +6088,7 @@
       <w:tr>
         <w:tc>
           <w:tcPr>
-            <w:tcW w:type="dxa" w:w="4333"/>
+            <w:tcW w:type="dxa" w:w="4309"/>
             <w:shd w:fill="F6F8FB" w:val="clear"/>
             <w:tcMar>
               <w:top w:type="dxa" w:w="70"/>
@@ -6114,7 +6114,7 @@
         </w:tc>
         <w:tc>
           <w:tcPr>
-            <w:tcW w:type="dxa" w:w="5027"/>
+            <w:tcW w:type="dxa" w:w="5051"/>
             <w:shd w:fill="F6F8FB" w:val="clear"/>
             <w:tcMar>
               <w:top w:type="dxa" w:w="70"/>
@@ -6142,7 +6142,7 @@
       <w:tr>
         <w:tc>
           <w:tcPr>
-            <w:tcW w:type="dxa" w:w="4333"/>
+            <w:tcW w:type="dxa" w:w="4309"/>
             <w:shd w:fill="FFFFFF" w:val="clear"/>
             <w:tcMar>
               <w:top w:type="dxa" w:w="70"/>
@@ -6168,7 +6168,7 @@
         </w:tc>
         <w:tc>
           <w:tcPr>
-            <w:tcW w:type="dxa" w:w="5027"/>
+            <w:tcW w:type="dxa" w:w="5051"/>
             <w:shd w:fill="FFFFFF" w:val="clear"/>
             <w:tcMar>
               <w:top w:type="dxa" w:w="70"/>
@@ -6196,7 +6196,7 @@
       <w:tr>
         <w:tc>
           <w:tcPr>
-            <w:tcW w:type="dxa" w:w="4333"/>
+            <w:tcW w:type="dxa" w:w="4309"/>
             <w:shd w:fill="F6F8FB" w:val="clear"/>
             <w:tcMar>
               <w:top w:type="dxa" w:w="70"/>
@@ -6222,7 +6222,7 @@
         </w:tc>
         <w:tc>
           <w:tcPr>
-            <w:tcW w:type="dxa" w:w="5027"/>
+            <w:tcW w:type="dxa" w:w="5051"/>
             <w:shd w:fill="F6F8FB" w:val="clear"/>
             <w:tcMar>
               <w:top w:type="dxa" w:w="70"/>
@@ -6250,7 +6250,7 @@
       <w:tr>
         <w:tc>
           <w:tcPr>
-            <w:tcW w:type="dxa" w:w="4333"/>
+            <w:tcW w:type="dxa" w:w="4309"/>
             <w:shd w:fill="FFFFFF" w:val="clear"/>
             <w:tcMar>
               <w:top w:type="dxa" w:w="70"/>
@@ -6276,7 +6276,7 @@
         </w:tc>
         <w:tc>
           <w:tcPr>
-            <w:tcW w:type="dxa" w:w="5027"/>
+            <w:tcW w:type="dxa" w:w="5051"/>
             <w:shd w:fill="FFFFFF" w:val="clear"/>
             <w:tcMar>
               <w:top w:type="dxa" w:w="70"/>
@@ -6304,7 +6304,7 @@
       <w:tr>
         <w:tc>
           <w:tcPr>
-            <w:tcW w:type="dxa" w:w="4333"/>
+            <w:tcW w:type="dxa" w:w="4309"/>
             <w:shd w:fill="F6F8FB" w:val="clear"/>
             <w:tcMar>
               <w:top w:type="dxa" w:w="70"/>
@@ -6330,7 +6330,7 @@
         </w:tc>
         <w:tc>
           <w:tcPr>
-            <w:tcW w:type="dxa" w:w="5027"/>
+            <w:tcW w:type="dxa" w:w="5051"/>
             <w:shd w:fill="F6F8FB" w:val="clear"/>
             <w:tcMar>
               <w:top w:type="dxa" w:w="70"/>
@@ -6358,7 +6358,7 @@
       <w:tr>
         <w:tc>
           <w:tcPr>
-            <w:tcW w:type="dxa" w:w="4333"/>
+            <w:tcW w:type="dxa" w:w="4309"/>
             <w:shd w:fill="FFFFFF" w:val="clear"/>
             <w:tcMar>
               <w:top w:type="dxa" w:w="70"/>
@@ -6384,7 +6384,7 @@
         </w:tc>
         <w:tc>
           <w:tcPr>
-            <w:tcW w:type="dxa" w:w="5027"/>
+            <w:tcW w:type="dxa" w:w="5051"/>
             <w:shd w:fill="FFFFFF" w:val="clear"/>
             <w:tcMar>
               <w:top w:type="dxa" w:w="70"/>
@@ -6412,7 +6412,7 @@
       <w:tr>
         <w:tc>
           <w:tcPr>
-            <w:tcW w:type="dxa" w:w="4333"/>
+            <w:tcW w:type="dxa" w:w="4309"/>
             <w:shd w:fill="F6F8FB" w:val="clear"/>
             <w:tcMar>
               <w:top w:type="dxa" w:w="70"/>
@@ -6438,7 +6438,7 @@
         </w:tc>
         <w:tc>
           <w:tcPr>
-            <w:tcW w:type="dxa" w:w="5027"/>
+            <w:tcW w:type="dxa" w:w="5051"/>
             <w:shd w:fill="F6F8FB" w:val="clear"/>
             <w:tcMar>
               <w:top w:type="dxa" w:w="70"/>
@@ -6466,7 +6466,7 @@
       <w:tr>
         <w:tc>
           <w:tcPr>
-            <w:tcW w:type="dxa" w:w="4333"/>
+            <w:tcW w:type="dxa" w:w="4309"/>
             <w:shd w:fill="FFFFFF" w:val="clear"/>
             <w:tcMar>
               <w:top w:type="dxa" w:w="70"/>
@@ -6492,7 +6492,7 @@
         </w:tc>
         <w:tc>
           <w:tcPr>
-            <w:tcW w:type="dxa" w:w="5027"/>
+            <w:tcW w:type="dxa" w:w="5051"/>
             <w:shd w:fill="FFFFFF" w:val="clear"/>
             <w:tcMar>
               <w:top w:type="dxa" w:w="70"/>
@@ -6520,7 +6520,7 @@
       <w:tr>
         <w:tc>
           <w:tcPr>
-            <w:tcW w:type="dxa" w:w="4333"/>
+            <w:tcW w:type="dxa" w:w="4309"/>
             <w:shd w:fill="F6F8FB" w:val="clear"/>
             <w:tcMar>
               <w:top w:type="dxa" w:w="70"/>
@@ -6546,7 +6546,7 @@
         </w:tc>
         <w:tc>
           <w:tcPr>
-            <w:tcW w:type="dxa" w:w="5027"/>
+            <w:tcW w:type="dxa" w:w="5051"/>
             <w:shd w:fill="F6F8FB" w:val="clear"/>
             <w:tcMar>
               <w:top w:type="dxa" w:w="70"/>
@@ -6574,7 +6574,7 @@
       <w:tr>
         <w:tc>
           <w:tcPr>
-            <w:tcW w:type="dxa" w:w="4333"/>
+            <w:tcW w:type="dxa" w:w="4309"/>
             <w:shd w:fill="FFFFFF" w:val="clear"/>
             <w:tcMar>
               <w:top w:type="dxa" w:w="70"/>
@@ -6600,7 +6600,7 @@
         </w:tc>
         <w:tc>
           <w:tcPr>
-            <w:tcW w:type="dxa" w:w="5027"/>
+            <w:tcW w:type="dxa" w:w="5051"/>
             <w:shd w:fill="FFFFFF" w:val="clear"/>
             <w:tcMar>
               <w:top w:type="dxa" w:w="70"/>
@@ -6628,7 +6628,7 @@
       <w:tr>
         <w:tc>
           <w:tcPr>
-            <w:tcW w:type="dxa" w:w="4333"/>
+            <w:tcW w:type="dxa" w:w="4309"/>
             <w:shd w:fill="F6F8FB" w:val="clear"/>
             <w:tcMar>
               <w:top w:type="dxa" w:w="70"/>
@@ -6654,7 +6654,7 @@
         </w:tc>
         <w:tc>
           <w:tcPr>
-            <w:tcW w:type="dxa" w:w="5027"/>
+            <w:tcW w:type="dxa" w:w="5051"/>
             <w:shd w:fill="F6F8FB" w:val="clear"/>
             <w:tcMar>
               <w:top w:type="dxa" w:w="70"/>
@@ -6682,7 +6682,7 @@
       <w:tr>
         <w:tc>
           <w:tcPr>
-            <w:tcW w:type="dxa" w:w="4333"/>
+            <w:tcW w:type="dxa" w:w="4309"/>
             <w:shd w:fill="FFFFFF" w:val="clear"/>
             <w:tcMar>
               <w:top w:type="dxa" w:w="70"/>
@@ -6708,7 +6708,7 @@
         </w:tc>
         <w:tc>
           <w:tcPr>
-            <w:tcW w:type="dxa" w:w="5027"/>
+            <w:tcW w:type="dxa" w:w="5051"/>
             <w:shd w:fill="FFFFFF" w:val="clear"/>
             <w:tcMar>
               <w:top w:type="dxa" w:w="70"/>
@@ -6736,7 +6736,7 @@
       <w:tr>
         <w:tc>
           <w:tcPr>
-            <w:tcW w:type="dxa" w:w="4333"/>
+            <w:tcW w:type="dxa" w:w="4309"/>
             <w:shd w:fill="F6F8FB" w:val="clear"/>
             <w:tcMar>
               <w:top w:type="dxa" w:w="70"/>
@@ -6762,7 +6762,7 @@
         </w:tc>
         <w:tc>
           <w:tcPr>
-            <w:tcW w:type="dxa" w:w="5027"/>
+            <w:tcW w:type="dxa" w:w="5051"/>
             <w:shd w:fill="F6F8FB" w:val="clear"/>
             <w:tcMar>
               <w:top w:type="dxa" w:w="70"/>
@@ -6790,7 +6790,7 @@
       <w:tr>
         <w:tc>
           <w:tcPr>
-            <w:tcW w:type="dxa" w:w="4333"/>
+            <w:tcW w:type="dxa" w:w="4309"/>
             <w:shd w:fill="FFFFFF" w:val="clear"/>
             <w:tcMar>
               <w:top w:type="dxa" w:w="70"/>
@@ -6816,7 +6816,7 @@
         </w:tc>
         <w:tc>
           <w:tcPr>
-            <w:tcW w:type="dxa" w:w="5027"/>
+            <w:tcW w:type="dxa" w:w="5051"/>
             <w:shd w:fill="FFFFFF" w:val="clear"/>
             <w:tcMar>
               <w:top w:type="dxa" w:w="70"/>
@@ -6844,7 +6844,7 @@
       <w:tr>
         <w:tc>
           <w:tcPr>
-            <w:tcW w:type="dxa" w:w="4333"/>
+            <w:tcW w:type="dxa" w:w="4309"/>
             <w:shd w:fill="F6F8FB" w:val="clear"/>
             <w:tcMar>
               <w:top w:type="dxa" w:w="70"/>
@@ -6870,7 +6870,7 @@
         </w:tc>
         <w:tc>
           <w:tcPr>
-            <w:tcW w:type="dxa" w:w="5027"/>
+            <w:tcW w:type="dxa" w:w="5051"/>
             <w:shd w:fill="F6F8FB" w:val="clear"/>
             <w:tcMar>
               <w:top w:type="dxa" w:w="70"/>

</xml_diff>